<commit_message>
Configuracion para Vercel y Neon
</commit_message>
<xml_diff>
--- a/servidor/almacenamiento/documento-1774330098300-721488074.docx
+++ b/servidor/almacenamiento/documento-1774330098300-721488074.docx
@@ -103,7 +103,7 @@
           <w:sz w:val="24"/>
           <w:lang w:val="es-EC"/>
         </w:rPr>
-        <w:t>Quito, ….</w:t>
+        <w:t>Quito, [[FECHA]]          ….</w:t>
       </w:r>
       <w:proofErr w:type="gramEnd"/>
       <w:r>
@@ -343,7 +343,7 @@
           <w:sz w:val="24"/>
           <w:lang w:val="es-EC"/>
         </w:rPr>
-        <w:t xml:space="preserve"> (CI…), </w:t>
+        <w:t xml:space="preserve"> (CI…) [[CEDULA]]         , </w:t>
       </w:r>
       <w:r>
         <w:rPr>

</xml_diff>